<commit_message>
Reproducible installer build, CI workflow, PowerShell test harness
- scripts/build-installer.py builds deterministic hardgate-v<VER>.zip
- scripts/build-docs.py regenerates README/USER-MANUAL .txt/.docx/.pdf
- scripts/test-installer.ps1 mirrors the bash harness for Windows
- .github/workflows/ci.yml runs install.sh + install.ps1 + drift check
- dist/hardgate-v1.0.0.zip rebuilt via build-installer.py for CI parity
  sha256 9f4f521d7db0d47d10d3a35503e8f3dd8bd1be05b09ee184f2238e82c2d497fc
</commit_message>
<xml_diff>
--- a/README.docx
+++ b/README.docx
@@ -7,12 +7,15 @@
         <w:pStyle w:val="Title"/>
       </w:pPr>
       <w:r>
-        <w:t>hardgate — README</w:t>
+        <w:t>hardgate - README</w:t>
       </w:r>
     </w:p>
     <w:p>
       <w:r>
-        <w:t>Copyright © 2026 Scott Converse · MIT License</w:t>
+        <w:rPr>
+          <w:i/>
+        </w:rPr>
+        <w:t>Copyright (c) 2026 Scott Converse - MIT License</w:t>
       </w:r>
     </w:p>
     <w:p>
@@ -978,7 +981,7 @@
         <w:pStyle w:val="Heading1"/>
       </w:pPr>
       <w:r>
-        <w:t>Appendix: Architecture Diagram (UML — Mermaid source)</w:t>
+        <w:t>Appendix: Architecture Diagram (UML - Mermaid source)</w:t>
       </w:r>
     </w:p>
     <w:p>

</xml_diff>